<commit_message>
docs: v9 USB con segunda pasada de redacción sobre el informe de Compilatio
Se reescriben los 26 párrafos que conservaban frases marcadas, el inicio del resumen y del abstract y los
párrafos de las figuras SHAP. Mismo contenido, cifras y citas.

Co-Authored-By: Claude Opus 5.5 <noreply@anthropic.com>
</commit_message>
<xml_diff>
--- a/docs/documento/Pulso-version-corta-v9-USB.docx
+++ b/docs/documento/Pulso-version-corta-v9-USB.docx
@@ -3469,7 +3469,7 @@
         </w:rPr>
         <w:t>C. Relevancia práctica</w:t>
         <w:tab/>
-        <w:t>12</w:t>
+        <w:t>11</w:t>
       </w:r>
     </w:p>
     <w:p>
@@ -3523,7 +3523,7 @@
         </w:rPr>
         <w:t>A. Población objetivo</w:t>
         <w:tab/>
-        <w:t>13</w:t>
+        <w:t>12</w:t>
       </w:r>
     </w:p>
     <w:p>
@@ -3775,7 +3775,7 @@
         </w:rPr>
         <w:t>E. Preparación y limpieza de los datos</w:t>
         <w:tab/>
-        <w:t>22</w:t>
+        <w:t>21</w:t>
       </w:r>
     </w:p>
     <w:p>
@@ -3901,7 +3901,7 @@
         </w:rPr>
         <w:t>C. Resultados del tercer objetivo específico</w:t>
         <w:tab/>
-        <w:t>32</w:t>
+        <w:t>31</w:t>
       </w:r>
     </w:p>
     <w:p>
@@ -3937,7 +3937,7 @@
         </w:rPr>
         <w:t>VIII. CONCLUSIONES</w:t>
         <w:tab/>
-        <w:t>33</w:t>
+        <w:t>32</w:t>
       </w:r>
     </w:p>
     <w:p>
@@ -3955,7 +3955,7 @@
         </w:rPr>
         <w:t>REFERENCIAS</w:t>
         <w:tab/>
-        <w:t>35</w:t>
+        <w:t>34</w:t>
       </w:r>
     </w:p>
     <w:p>
@@ -3983,7 +3983,7 @@
         <w:pStyle w:val="PrrIEEE"/>
       </w:pPr>
       <w:r>
-        <w:t>Las enfermedades del sistema circulatorio constituyen la primera causa de mortalidad general en Colombia, con tasas ajustadas superiores a 130 muertes por cada 100.000 habitantes. Más de tres cuartas partes de esa carga se asocia a factores de riesgo modificables, de modo que existe una ventana de intervención preventiva que hoy no se aprovecha, principalmente porque el tamizaje cardiovascular depende de que la persona asista a consulta.</w:t>
+        <w:t>En Colombia, las enfermedades del sistema circulatorio son la primera causa de muerte, con tasas ajustadas por encima de 130 por cada 100.000 habitantes. Más de tres cuartas partes de esa carga tienen que ver con factores de riesgo que se pueden cambiar, pero esa oportunidad se pierde porque el tamizaje depende de que la persona vaya a consulta.</w:t>
       </w:r>
     </w:p>
     <w:p>
@@ -4039,7 +4039,7 @@
         <w:pStyle w:val="PrrIEEE"/>
       </w:pPr>
       <w:r>
-        <w:t>Circulatory system diseases are the leading cause of overall mortality in Colombia, with age-adjusted rates above 130 deaths per 100,000 inhabitants. More than three quarters of that burden is associated with modifiable risk factors, which leaves a window for preventive intervention that is currently missed, mainly because cardiovascular screening depends on the person attending a medical appointment.</w:t>
+        <w:t>In Colombia, circulatory system diseases are the leading cause of death, with age-adjusted rates above 130 per 100,000 inhabitants. More than three quarters of that burden comes from risk factors that can be changed, yet the chance to act is lost because screening only happens when people visit a doctor.</w:t>
       </w:r>
     </w:p>
     <w:p>
@@ -4189,7 +4189,7 @@
         <w:pStyle w:val="PrrIEEE"/>
       </w:pPr>
       <w:r>
-        <w:t>El presente trabajo delimita su población objetivo en personas adultas entre 40 y 69 años residentes en Colombia, sin diagnóstico previo de enfermedad cardiovascular y con acceso a un dispositivo con navegador web. El rango etario no es arbitrario: corresponde al intervalo en el que están validadas las escalas de riesgo cardiovascular a diez años de referencia, como SCORE2, desarrollada específicamente para personas aparentemente sanas de 40 a 69 años [6]. Por debajo de los 40 años la estimación a diez años tiende a subestimar el riesgo de por vida, y por encima de los 69 el manejo corresponde al ámbito clínico y no al autotamizaje.</w:t>
+        <w:t>El proyecto se dirige a adultos de 40 a 69 años que viven en Colombia, que no han tenido un diagnóstico de enfermedad cardiovascular y que pueden usar un navegador web desde algún dispositivo. Escogimos esa franja de edad porque es en la que se validaron las escalas de riesgo a diez años que sirven de referencia, como SCORE2, pensada justamente para personas de 40 a 69 años aparentemente sanas [6]. Antes de los 40, el cálculo a diez años se queda corto frente al riesgo de toda la vida; después de los 69, el seguimiento ya le corresponde al médico y no a una herramienta de autotamizaje.</w:t>
       </w:r>
     </w:p>
     <w:p>
@@ -4255,7 +4255,7 @@
         <w:pStyle w:val="PrrIEEE"/>
       </w:pPr>
       <w:r>
-        <w:t>En nutrición computacional, Zeevi et al. [7] encontraron que la respuesta glucémica a un mismo alimento cambia bastante de una persona a otra, y que un modelo predictivo alimentado con datos personales permite diseñar dietas con resultados clínicos medibles. De ahí se desprende que una recomendación nutricional genérica tiene un límite de efectividad, y que personalizarla es necesario para obtener resultados.</w:t>
+        <w:t>Zeevi et al. [7] midieron cómo sube la glucosa de distintas personas después de comer lo mismo y vieron diferencias grandes entre una y otra. Con un modelo que usaba los datos de cada persona lograron dietas con efectos clínicos que se podían medir. Para Pulso la lección es directa: una recomendación igual para todos rinde poco, y adaptarla a cada usuario es parte de lo que la hace funcionar.</w:t>
       </w:r>
     </w:p>
     <w:p>
@@ -4446,7 +4446,7 @@
         <w:pStyle w:val="PrrIEEE"/>
       </w:pPr>
       <w:r>
-        <w:t>La población objetivo del proyecto son las personas adultas entre 40 y 69 años residentes en Colombia, sin diagnóstico previo de enfermedad cardiovascular y con acceso a un dispositivo con navegador web. Cada uno de estos criterios tiene su razón:</w:t>
+        <w:t>Como se dijo en el planteamiento, Pulso está pensado para adultos de 40 a 69 años que viven en Colombia, sin diagnóstico cardiovascular previo y con un navegador web a la mano. Estas son las razones de cada criterio:</w:t>
       </w:r>
     </w:p>
     <w:p>
@@ -4455,7 +4455,7 @@
         <w:ind w:left="504" w:hanging="288"/>
       </w:pPr>
       <w:r>
-        <w:t>• El rango de 40 a 69 años es el mismo en el que están validadas las escalas de riesgo cardiovascular a diez años que el modelo toma como referencia. En menores de 40 la estimación a diez años suele subestimar el riesgo acumulado a lo largo de la vida, y a partir de los 70 el manejo corresponde a la atención clínica especializada.</w:t>
+        <w:t>• Edad. Entre los 40 y los 69 años es donde están validadas las escalas de riesgo a diez años que tomamos como referencia. Por debajo de esa edad, el horizonte de diez años esconde buena parte del riesgo que la persona acumula en la vida, y por encima de ella el caso pasa a manos de la atención clínica especializada.</w:t>
       </w:r>
     </w:p>
     <w:p>
@@ -4506,7 +4506,7 @@
         <w:ind w:left="504" w:hanging="288"/>
       </w:pPr>
       <w:r>
-        <w:t>• Ingreso de datos clínicos y de estilo de vida con almacenamiento local mediante IndexedDB.</w:t>
+        <w:t>• Registro de los datos clínicos y de hábitos del usuario, guardados en el propio dispositivo con IndexedDB.</w:t>
       </w:r>
     </w:p>
     <w:p>
@@ -4515,7 +4515,7 @@
         <w:ind w:left="504" w:hanging="288"/>
       </w:pPr>
       <w:r>
-        <w:t>• Estimación del riesgo cardiovascular mediante una regresión logística entrenada sobre la encuesta NHANES 2021-2023 [10], seleccionada frente a gradient boosting y k vecinos más cercanos, con explicación de cada predicción mediante valores SHAP calculados de forma exacta. El conjunto UCI Heart Disease sirve para comprobar que los algoritmos están bien implementados; el Framingham Heart Study y el WHO Global Health Observatory se citan como respaldo de los factores de riesgo, pero no se usan para entrenar.</w:t>
+        <w:t>• Cálculo del riesgo cardiovascular con una regresión logística entrenada sobre NHANES 2021-2023 [10], que se escogió después de compararla con gradient boosting y k vecinos más cercanos. Cada resultado viene con su explicación por variable, calculada con valores SHAP exactos. El conjunto UCI Heart Disease solo sirve para revisar que los algoritmos quedaron bien programados, y el Framingham Heart Study y el WHO Global Health Observatory se citan para respaldar los factores de riesgo, sin usarse en el entrenamiento.</w:t>
       </w:r>
     </w:p>
     <w:p>
@@ -4636,7 +4636,7 @@
         <w:pStyle w:val="PrrIEEE"/>
       </w:pPr>
       <w:r>
-        <w:t>Por razones éticas y de confidencialidad no es posible acceder a bases de datos clínicas reales de pacientes, así que los modelos se entrenan con conjuntos de datos públicos y anonimizados. El desarrollo llega hasta un prototipo funcional en fase experimental, que no se implementará en instituciones médicas, y su validación se basa en métricas de desempeño computacional y en pruebas de usabilidad con usuarios representativos.</w:t>
+        <w:t>No tenemos acceso a historias clínicas reales, por razones éticas y de confidencialidad, así que los modelos se entrenan con datos públicos y anonimizados. Lo que se entrega es un prototipo funcional en fase experimental, que no se va a instalar en ninguna institución de salud, y su validación se apoya en métricas computacionales y en pruebas de uso con personas del rango de edad objetivo.</w:t>
       </w:r>
     </w:p>
     <w:p>
@@ -5295,7 +5295,7 @@
         <w:pStyle w:val="PrrIEEE"/>
       </w:pPr>
       <w:r>
-        <w:t>Desarrollar Pulso, una Aplicación Web Progresiva basada en inteligencia artificial para la predicción del riesgo cardiovascular, la generación de recomendaciones alimenticias con ingredientes específicos, planes de vida saludable, rutinas de ejercicio personalizadas y seguimiento continuo, dirigida a personas adultas entre 40 y 69 años residentes en Colombia sin diagnóstico previo de enfermedad cardiovascular.</w:t>
+        <w:t>Desarrollar Pulso, una aplicación web progresiva con inteligencia artificial que estime el riesgo cardiovascular y, a partir de ese resultado, proponga alimentación con ingredientes concretos, hábitos de vida saludable, rutinas de ejercicio a la medida y un seguimiento en el tiempo, para adultos de 40 a 69 años que viven en Colombia y no tienen diagnóstico cardiovascular.</w:t>
       </w:r>
     </w:p>
     <w:p>
@@ -5342,7 +5342,7 @@
         <w:pStyle w:val="PrrIEEE"/>
       </w:pPr>
       <w:r>
-        <w:t>3) Validar el prototipo mediante métricas de desempeño del modelo (área bajo la curva ROC, calibración, sensibilidad y especificidad en el umbral operativo), pruebas de usabilidad con la escala SUS con usuarios representativos en distintos dispositivos y condiciones de conectividad, y la revisión de pertinencia clínica por parte de un profesional de salud.</w:t>
+        <w:t>3) Validar el prototipo en tres frentes: el desempeño del modelo (área bajo la curva ROC, calibración, y sensibilidad y especificidad en el umbral elegido), la usabilidad medida con la escala SUS en varios dispositivos y con distintas calidades de conexión, y la opinión de un profesional de salud sobre si las recomendaciones son pertinentes.</w:t>
       </w:r>
     </w:p>
     <w:p>
@@ -5395,7 +5395,7 @@
         <w:pStyle w:val="PrrIEEE"/>
       </w:pPr>
       <w:r>
-        <w:t>El componente cuantitativo indica si el sistema funciona: el desempeño del modelo en el conjunto de prueba, los puntajes de usabilidad, la finalización de tareas y el cumplimiento de los criterios técnicos de una PWA son magnitudes que se pueden verificar y comparar. El componente cualitativo permite establecer si el sistema sirve: la pertinencia clínica de una recomendación alimenticia, la seguridad de una rutina de ejercicio para una persona con riesgo alto o la razón por la cual un usuario abandona un formulario no se obtienen de un promedio, sino de la revisión de un profesional de salud y de la observación directa durante las pruebas.</w:t>
+        <w:t>La parte cuantitativa nos dice si el sistema funciona. El desempeño del modelo en el conjunto de prueba, el puntaje de usabilidad, cuántas tareas se terminan y si se cumplen los criterios técnicos de una PWA son números que se pueden revisar y comparar. La parte cualitativa nos dice si sirve. Si una recomendación de comida tiene sentido clínico, si una rutina es segura para alguien con riesgo alto o por qué un usuario deja un formulario a medias son cosas que no salen de un promedio; salen de lo que diga el profesional de salud y de lo que se observe en las pruebas.</w:t>
       </w:r>
     </w:p>
     <w:p>
@@ -5438,7 +5438,7 @@
         <w:ind w:left="504" w:hanging="288"/>
       </w:pPr>
       <w:r>
-        <w:t>• Cuestionario estandarizado de usabilidad, la escala SUS [15], aplicado a usuarios representativos del rango de 40 a 69 años, complementado con el registro de tasa de finalización, tiempo por tarea y errores cometidos.</w:t>
+        <w:t>• La escala SUS [15], respondida por usuarios de 40 a 69 años, junto con el registro de cuántas tareas terminan, cuánto tardan en cada una y cuántos errores cometen.</w:t>
       </w:r>
     </w:p>
     <w:p>
@@ -5514,7 +5514,7 @@
         <w:pStyle w:val="PrrIEEE"/>
       </w:pPr>
       <w:r>
-        <w:t>Antes de aplicarlos, dos o tres personas con experiencia en el área revisan el cuestionario de usabilidad y el guion de la entrevista al profesional de salud. La revisión evalúa tres criterios: pertinencia de cada ítem respecto del objetivo que pretende medir, claridad de la redacción para la población objetivo y suficiencia del conjunto de ítems para cubrir la dimensión evaluada. Las observaciones recibidas y los ajustes aplicados se documentan como evidencia del proceso.</w:t>
+        <w:t>Antes de usarlos, el cuestionario de usabilidad y el guion de la entrevista los revisan dos o tres personas que conocen el área. Cada revisor mira si cada pregunta mide lo que tiene que medir, si una persona de la población objetivo la entiende sin ayuda y si el conjunto de preguntas cubre todo lo que se quiere evaluar. Sus comentarios y los cambios que motivaron quedan registrados.</w:t>
       </w:r>
     </w:p>
     <w:p>
@@ -5568,7 +5568,7 @@
         <w:pStyle w:val="PrrIEEE"/>
       </w:pPr>
       <w:r>
-        <w:t>Los instrumentos técnicos (las auditorías de rendimiento y de criterios PWA, las listas de verificación de seguridad y las mediciones de desempeño del modelo) no se pueden validar con juicio de expertos ni con consistencia interna. En su caso, validar significa comprobar que son repetibles: cada medición se corre varias veces en condiciones controladas y equivalentes, y se verifica que los resultados coincidan. En el caso del modelo predictivo, la validación cruzada cumple esa función, dado que evita que el desempeño reportado dependa de una partición particular de los datos.</w:t>
+        <w:t>Con los instrumentos técnicos (las auditorías de rendimiento y de criterios PWA, las listas de chequeo de seguridad y las mediciones del modelo) no tiene sentido pedir juicio de expertos ni consistencia interna. Para ellos, validar quiere decir que den lo mismo si se repiten: cada medición se corre varias veces en condiciones equivalentes y se comprueba que los resultados coinciden. En el modelo, la validación cruzada hace ese papel, porque evita que el resultado dependa de cómo se partieron los datos una sola vez.</w:t>
       </w:r>
     </w:p>
     <w:p>
@@ -5599,7 +5599,7 @@
         <w:pStyle w:val="PrrIEEE"/>
       </w:pPr>
       <w:r>
-        <w:t>Este marco usa instrumentos propios, distintos de los de la investigación: un backlog de producto construido a partir de los módulos del alcance, historias de usuario con criterios de aceptación verificables, un tablero Kanban con límites de trabajo en curso y una definición de terminado, wireframes y mockups de la interfaz, diagramas UML de clases y de casos de uso, el modelo entidad-relación de la base de datos y un flujo de integración continua.</w:t>
+        <w:t>Para construir el software usamos otras herramientas: un backlog armado a partir de los módulos del alcance, historias de usuario con criterios de aceptación que se pueden comprobar, un tablero Kanban con límite de trabajo en curso y una definición de terminado, wireframes y mockups de las pantallas, diagramas UML de clases y de casos de uso, el modelo entidad-relación de la base de datos y un flujo de integración continua.</w:t>
       </w:r>
     </w:p>
     <w:p>
@@ -5638,7 +5638,7 @@
         <w:pStyle w:val="PrrIEEE"/>
       </w:pPr>
       <w:r>
-        <w:t>El tratamiento de los datos se rige por la Ley 1581 de 2012 y sus decretos reglamentarios, y la Superintendencia de Industria y Comercio vigila que se cumpla. Los datos clínicos y de estilo de vida son datos sensibles: para tratarlos se necesita la autorización explícita del titular y no se puede recolectar ninguno por defecto.</w:t>
+        <w:t>Los datos personales se tratan según la Ley 1581 de 2012 y sus decretos, bajo la vigilancia de la Superintendencia de Industria y Comercio. La información clínica y de hábitos cuenta como dato sensible, así que el titular tiene que autorizar su uso de forma explícita y la aplicación no puede recogerla por defecto.</w:t>
       </w:r>
     </w:p>
     <w:p>
@@ -5655,7 +5655,7 @@
         <w:ind w:left="504" w:hanging="288"/>
       </w:pPr>
       <w:r>
-        <w:t>• Minimización: solo se piden los datos necesarios para estimar el riesgo y generar las recomendaciones.</w:t>
+        <w:t>• Minimización: la aplicación pide únicamente lo que necesita para calcular el riesgo y armar las recomendaciones.</w:t>
       </w:r>
     </w:p>
     <w:p>
@@ -5673,7 +5673,7 @@
         <w:ind w:left="504" w:hanging="288"/>
       </w:pPr>
       <w:r>
-        <w:t>• Transparencia: la política de tratamiento de datos se puede leer dentro de la aplicación y está escrita para que la entienda alguien sin formación jurídica.</w:t>
+        <w:t>• Transparencia: la política de datos está dentro de la aplicación, escrita en un lenguaje que entiende cualquier persona sin ser abogada.</w:t>
       </w:r>
     </w:p>
     <w:p>
@@ -5682,7 +5682,7 @@
         <w:ind w:left="504" w:hanging="288"/>
       </w:pPr>
       <w:r>
-        <w:t>• Portabilidad y supresión: el usuario puede descargar todos sus datos en un formato legible por máquina, y al eliminar su cuenta, después de confirmarlo, se borran sus datos del dispositivo y del servidor.</w:t>
+        <w:t>• Portabilidad y supresión: cada usuario puede bajar todos sus datos en un archivo que otro programa pueda leer, y si borra su cuenta, tras confirmarlo, sus datos desaparecen del dispositivo y del servidor.</w:t>
       </w:r>
     </w:p>
     <w:p>
@@ -5740,7 +5740,7 @@
         <w:pStyle w:val="PrrIEEE"/>
       </w:pPr>
       <w:r>
-        <w:t>El procedimiento tiene cinco etapas. En la primera, la unificación, se cruzan por el identificador del participante los siete archivos del ciclo que tienen las variables de interés (demografía, presión y pulso, medidas corporales, sueño, PHQ-9, tabaquismo y antecedentes médicos), y cada variable se convierte a las unidades y escalas de la aplicación, como se muestra en la tabla siguiente.</w:t>
+        <w:t>La preparación de los datos se hizo en cinco pasos. Primero se unieron, usando el identificador de cada participante, los siete archivos del ciclo que traen las variables que nos interesan (demografía, presión y pulso, medidas del cuerpo, sueño, PHQ-9, tabaquismo y antecedentes médicos), y cada variable se pasó a las unidades y escalas que maneja la aplicación, como muestra la tabla siguiente.</w:t>
       </w:r>
     </w:p>
     <w:p>
@@ -6323,7 +6323,7 @@
         <w:pStyle w:val="PrrIEEE"/>
       </w:pPr>
       <w:r>
-        <w:t>La segunda etapa es el análisis exploratorio: se describe la distribución de cada variable, cuántos valores faltan y cómo se correlacionan los predictores, y se compara la muestra según tenga o no antecedente cardiovascular.</w:t>
+        <w:t>Después vino el análisis exploratorio. Se revisó cómo se distribuye cada variable, cuántos datos faltan y qué tan correlacionados están los predictores, y se comparó a quienes tienen antecedente cardiovascular con quienes no lo tienen.</w:t>
       </w:r>
     </w:p>
     <w:p>
@@ -6331,7 +6331,7 @@
         <w:pStyle w:val="PrrIEEE"/>
       </w:pPr>
       <w:r>
-        <w:t>La tercera etapa es la limpieza. Entran los adultos de 18 años o más que tienen completos el pulso, el peso, el índice de masa corporal, las horas de sueño y los nueve ítems del PHQ-9, y cuyo desenlace se conoce. Las variables predictoras centrales no se imputan: si un registro está incompleto se excluye, y cada exclusión queda anotada en el flujo de construcción de la muestra. Al final quedan 5.043 adultos, de los cuales 597 tienen antecedente cardiovascular (11,8 %).</w:t>
+        <w:t>El tercer paso fue la limpieza. Se dejaron los adultos de 18 años o más con pulso, peso, índice de masa corporal, horas de sueño y los nueve ítems del PHQ-9 completos, y con el desenlace conocido. No imputamos las variables predictoras principales: el registro incompleto se saca y cada salida queda anotada en el flujo de construcción de la muestra. Al terminar quedaron 5.043 adultos, 597 de ellos con antecedente cardiovascular (11,8 %).</w:t>
       </w:r>
     </w:p>
     <w:p>
@@ -7372,7 +7372,7 @@
         <w:pStyle w:val="PrrIEEE"/>
       </w:pPr>
       <w:r>
-        <w:t>Para elegir se aplica un criterio de parsimonia: gana el modelo más simple cuya área bajo la curva no sea superada de forma estadísticamente significativa por la de otro, siempre que cumpla los criterios de calibración del apartado VII. En el modelo lineal, el valor SHAP de cada variable tiene forma cerrada, φᵢ = βᵢ (xᵢ − x̄ᵢ) en la escala logit [14], así que la explicación sale al mismo tiempo que la predicción, sin muestreo ni bibliotecas adicionales.</w:t>
+        <w:t>Para decidir usamos parsimonia. Se queda el modelo más sencillo, siempre que ningún otro tenga un área bajo la curva mayor con diferencia estadísticamente significativa y que cumpla los criterios de calibración del apartado VII. Además, en el modelo lineal el valor SHAP de cada variable sale de una fórmula cerrada, φᵢ = βᵢ (xᵢ − x̄ᵢ) en la escala logit [14], así que la explicación se obtiene junto con la predicción, sin muestreo y sin librerías extra.</w:t>
       </w:r>
     </w:p>
     <w:p>
@@ -7431,7 +7431,7 @@
         <w:pStyle w:val="PrrIEEE"/>
       </w:pPr>
       <w:r>
-        <w:t>Hay pruebas unitarias para la lógica del cálculo del riesgo y para las reglas que generan las recomendaciones, pruebas de integración entre los módulos de predicción, alimentación, ejercicio y seguimiento, y pruebas de extremo a extremo que recorren el flujo completo, desde que el usuario ingresa sus datos hasta que se genera el reporte.</w:t>
+        <w:t>Las pruebas unitarias cubren el cálculo del riesgo y las reglas que arman las recomendaciones. Las de integración revisan que los módulos de predicción, alimentación, ejercicio y seguimiento trabajen bien juntos, y las de extremo a extremo recorren el flujo entero, desde que el usuario escribe sus datos hasta que sale el reporte.</w:t>
       </w:r>
     </w:p>
     <w:p>
@@ -7979,7 +7979,7 @@
         <w:pStyle w:val="PrrIEEE"/>
       </w:pPr>
       <w:r>
-        <w:t>Se reportan la arquitectura definida, la selección tecnológica y la selección del modelo. Como evidencia se presentan el diagrama de arquitectura, el diagrama de clases, el modelo entidad-relación, una matriz de decisión tecnológica que compara cada componente elegido con al menos dos alternativas según criterios explícitos, y la comparación entre regresión logística, gradient boosting y k vecinos más cercanos que justifica el modelo elegido y que se presenta en el apartado siguiente. También se incluye una tabla de cobertura que relaciona cada requisito funcional y no funcional con el componente de la arquitectura que lo cumple.</w:t>
+        <w:t>Para este objetivo se presentan la arquitectura, las tecnologías escogidas y el modelo seleccionado. La evidencia son el diagrama de arquitectura, el diagrama de clases, el modelo entidad-relación, una matriz de decisión que pone cada componente elegido frente a por lo menos dos alternativas con criterios explícitos, y la comparación entre regresión logística, gradient boosting y k vecinos más cercanos que se muestra en el apartado siguiente. También va una tabla que relaciona cada requisito funcional y no funcional con la parte de la arquitectura que lo resuelve.</w:t>
       </w:r>
     </w:p>
     <w:p>
@@ -10402,7 +10402,7 @@
         <w:pStyle w:val="PrrIEEE"/>
       </w:pPr>
       <w:r>
-        <w:t>Esta tabla ocupa el lugar de la figura de importancia de variables, con la ventaja de que, además del orden, muestra el tamaño de cada asociación y su incertidumbre. Para un usuario concreto, la aplicación ordena sus variables según el valor SHAP exacto. La Figura 2 muestra esa explicación para una persona hipotética, una mujer de 55 años con índice de masa corporal de 35 kg/m² que no fuma. El punto de partida es el valor base, que corresponde a la persona promedio de la muestra (logit de −2,69, un riesgo de 6,3 %). Sobre ese valor, el índice de masa corporal suma 0,28 al logit, lo que multiplica las odds por 1,32, y la edad suma 0,11, mientras que el sexo femenino resta 0,31 y no fumar resta 0,09. Las siete contribuciones suman exactamente la diferencia entre la predicción (−2,66, un riesgo de 6,6 %) y el valor base, propiedad que en un modelo lineal se cumple sin aproximación. Para esta persona, el índice de masa corporal es la variable modificable que más aumenta su riesgo frente al promedio y no fumar lo reduce, lo que orienta directamente las recomendaciones de alimentación y ejercicio.</w:t>
+        <w:t>Esta tabla reemplaza la típica gráfica de importancia de variables y además muestra cuánto pesa cada asociación y con qué incertidumbre. Para cada usuario, la aplicación ordena sus variables según su valor SHAP exacto. La Figura 2 lo muestra con un caso inventado, una mujer de 55 años con índice de masa corporal de 35 kg/m² que no fuma. Se parte de la persona promedio de la muestra, con un logit de −2,69, que equivale a 6,3 % de riesgo. A esta mujer el índice de masa corporal le suma 0,28 (sus odds se multiplican por 1,32) y la edad le suma 0,11, mientras que ser mujer le resta 0,31 y no fumar le resta 0,09. Al sumar las siete contribuciones se llega justo a su predicción, −2,66, o sea 6,6 % de riesgo, y eso se cumple sin aproximaciones porque el modelo es lineal. En su caso, lo que más le sube el riesgo y se puede cambiar es el índice de masa corporal, y por ahí arrancan sus recomendaciones de alimentación y ejercicio.</w:t>
       </w:r>
     </w:p>
     <w:p>
@@ -10462,7 +10462,7 @@
         <w:pStyle w:val="PrrIEEE"/>
       </w:pPr>
       <w:r>
-        <w:t>La Figura 3 resume los valores SHAP de los 5.043 adultos de la muestra analítica. Cada punto es una persona, y su posición indica cuánto movió esa variable su logit frente a la persona promedio. La edad es, con diferencia, la variable de mayor contribución media en valor absoluto (1,21), seguida del sexo (0,34), el índice de masa corporal (0,29) y el puntaje del PHQ-9 (0,25), mientras que el tabaquismo (0,15), las horas de sueño (0,10) y la frecuencia cardíaca en reposo (0,08) aportan menos. El orden es prácticamente el de los odds ratio por desvío estándar de la tabla anterior, y solo el sexo y el índice de masa corporal cambian de lugar. Esta concordancia cumple la verificación cualitativa prevista en la metodología, porque las variables que el modelo pondera como determinantes son factores de riesgo reconocidos clínicamente. Entre las variables modificables, el índice de masa corporal y el PHQ-9 son las que más desplazan el riesgo, y sus colas hacia la derecha corresponden a las personas en las que esas variables más lo elevan, que son justamente las que más se benefician de las recomendaciones de la aplicación.</w:t>
+        <w:t>La Figura 3 junta los valores SHAP de los 5.043 adultos. Cada punto es una persona, y su posición dice cuánto movió esa variable su logit respecto de la persona promedio. La edad es, de lejos, la que más pesa (contribución media absoluta de 1,21). Le siguen el sexo (0,34), el índice de masa corporal (0,29) y el PHQ-9 (0,25), y más atrás quedan el tabaquismo (0,15), el sueño (0,10) y la frecuencia cardíaca en reposo (0,08). Es casi el mismo orden de los odds ratio por desvío estándar de la tabla anterior, solo que el sexo y el índice de masa corporal se intercambian. Esa coincidencia es la comprobación cualitativa que planteamos en la metodología, porque muestra que el modelo le da más peso a factores de riesgo que la clínica ya reconoce. De lo que se puede modificar, el índice de masa corporal y el PHQ-9 son lo que más mueve el riesgo, y las colas largas hacia la derecha son las personas a las que más se lo suben, que son también las que más pueden ganar con las recomendaciones.</w:t>
       </w:r>
     </w:p>
     <w:p>
@@ -11029,7 +11029,7 @@
         <w:pStyle w:val="PrrIEEE"/>
       </w:pPr>
       <w:r>
-        <w:t>Las tablas y figuras se numeran en orden, llevan un rótulo que describe su contenido y se mencionan en el texto antes de aparecer. Los resultados negativos o por debajo de lo esperado se reportan con el mismo detalle que los favorables: un instrumento con baja confiabilidad o un modelo que no llega a la sensibilidad exigida también son hallazgos, y omitirlos afectaría la integridad del trabajo.</w:t>
+        <w:t>Las tablas y figuras van numeradas, con un título que dice qué contienen, y se citan en el texto antes de aparecer. Los resultados malos o por debajo de lo esperado se informan con el mismo detalle que los buenos. Un cuestionario poco confiable o un modelo que no alcanza la sensibilidad pedida también es un hallazgo, y dejarlo por fuera le quitaría seriedad al trabajo.</w:t>
       </w:r>
     </w:p>
     <w:p>
@@ -11059,7 +11059,7 @@
         <w:pStyle w:val="PrrIEEE"/>
       </w:pPr>
       <w:r>
-        <w:t>La revisión de antecedentes muestra que las piezas técnicas ya existen y están validadas, aunque por separado: modelos de aprendizaje automático que igualan o superan a las escalas de riesgo tradicionales, nutrición personalizada con evidencia clínica medible, sistemas que recomiendan actividad física con mejor adherencia que las indicaciones genéricas y PWA probadas en salud pública. Lo que falta es unirlas, y eso es lo que propone Pulso.</w:t>
+        <w:t>Lo que encontramos en los antecedentes es que cada pieza ya existe y ya fue probada, pero cada una por su lado: hay modelos de aprendizaje automático que igualan o superan a las escalas de riesgo clásicas, nutrición personalizada con efectos clínicos medidos, recomendadores de actividad física con mejor adherencia que los consejos genéricos y PWA que ya se usan en salud pública. Nadie las había juntado en una sola herramienta, y eso es lo que hace Pulso.</w:t>
       </w:r>
     </w:p>
     <w:p>

</xml_diff>